<commit_message>
Corriger les problèmes de formatage des variables de modèle
- Fixer le format de _SOCIETE_CAPITAL_ dans SARL-AU_2026-03_Declaration-Immatriculation-RC_Template.docx
- Corriger les erreurs de ligne dans SARL-AU_2026-07_Attestation-Domiciliation-Initiale_Template.docx
- Corriger _CONTRAT_DATE_ vers _CONTRAT_DATE_DEBUT_ et le problème de représentation par associé dans SARL-AU_2026-07_Contrat-Domiciliation_Template.docx

Ces corrections résolvent les problèmes de formatage des variables de modèle identifiés dans la revue du code
</commit_message>
<xml_diff>
--- a/templates/SARL AU/SARL-AU_2026-03_Declaration-Immatriculation-RC_Template.docx
+++ b/templates/SARL AU/SARL-AU_2026-03_Declaration-Immatriculation-RC_Template.docx
@@ -1,6 +1,6 @@
 
 <file path=word/document.xml><?xml version="1.0" encoding="utf-8"?>
-<w:document xmlns:wpc="http://schemas.microsoft.com/office/word/2010/wordprocessingCanvas" xmlns:cx="http://schemas.microsoft.com/office/drawing/2014/chartex" xmlns:cx1="http://schemas.microsoft.com/office/drawing/2015/9/8/chartex" xmlns:cx2="http://schemas.microsoft.com/office/drawing/2015/10/21/chartex" xmlns:cx3="http://schemas.microsoft.com/office/drawing/2016/5/9/chartex" xmlns:cx4="http://schemas.microsoft.com/office/drawing/2016/5/10/chartex" xmlns:cx5="http://schemas.microsoft.com/office/drawing/2016/5/11/chartex" xmlns:cx6="http://schemas.microsoft.com/office/drawing/2016/5/12/chartex" xmlns:cx7="http://schemas.microsoft.com/office/drawing/2016/5/13/chartex" xmlns:cx8="http://schemas.microsoft.com/office/drawing/2016/5/14/chartex" xmlns:mc="http://schemas.openxmlformats.org/markup-compatibility/2006" xmlns:aink="http://schemas.microsoft.com/office/drawing/2016/ink" xmlns:am3d="http://schemas.microsoft.com/office/drawing/2017/model3d" xmlns:o="urn:schemas-microsoft-com:office:office" xmlns:oel="http://schemas.microsoft.com/office/2019/extlst" xmlns:r="http://schemas.openxmlformats.org/officeDocument/2006/relationships" xmlns:m="http://schemas.openxmlformats.org/officeDocument/2006/math" xmlns:v="urn:schemas-microsoft-com:vml" xmlns:wp14="http://schemas.microsoft.com/office/word/2010/wordprocessingDrawing" xmlns:wp="http://schemas.openxmlformats.org/drawingml/2006/wordprocessingDrawing" xmlns:w10="urn:schemas-microsoft-com:office:word" xmlns:w="http://schemas.openxmlformats.org/wordprocessingml/2006/main" xmlns:w14="http://schemas.microsoft.com/office/word/2010/wordml" xmlns:w15="http://schemas.microsoft.com/office/word/2012/wordml" xmlns:w16cex="http://schemas.microsoft.com/office/word/2018/wordml/cex" xmlns:w16cid="http://schemas.microsoft.com/office/word/2016/wordml/cid" xmlns:w16="http://schemas.microsoft.com/office/word/2018/wordml" xmlns:w16sdtdh="http://schemas.microsoft.com/office/word/2020/wordml/sdtdatahash" xmlns:w16se="http://schemas.microsoft.com/office/word/2015/wordml/symex" xmlns:wpg="http://schemas.microsoft.com/office/word/2010/wordprocessingGroup" xmlns:wpi="http://schemas.microsoft.com/office/word/2010/wordprocessingInk" xmlns:wne="http://schemas.microsoft.com/office/word/2006/wordml" xmlns:wps="http://schemas.microsoft.com/office/word/2010/wordprocessingShape" mc:Ignorable="w14 w15 w16se w16cid w16 w16cex w16sdtdh wp14">
+<w:document xmlns:wpc="http://schemas.microsoft.com/office/word/2010/wordprocessingCanvas" xmlns:cx="http://schemas.microsoft.com/office/drawing/2014/chartex" xmlns:cx1="http://schemas.microsoft.com/office/drawing/2015/9/8/chartex" xmlns:cx2="http://schemas.microsoft.com/office/drawing/2015/10/21/chartex" xmlns:cx3="http://schemas.microsoft.com/office/drawing/2016/5/9/chartex" xmlns:cx4="http://schemas.microsoft.com/office/drawing/2016/5/10/chartex" xmlns:cx5="http://schemas.microsoft.com/office/drawing/2016/5/11/chartex" xmlns:cx6="http://schemas.microsoft.com/office/drawing/2016/5/12/chartex" xmlns:cx7="http://schemas.microsoft.com/office/drawing/2016/5/13/chartex" xmlns:cx8="http://schemas.microsoft.com/office/drawing/2016/5/14/chartex" xmlns:mc="http://schemas.openxmlformats.org/markup-compatibility/2006" xmlns:aink="http://schemas.microsoft.com/office/drawing/2016/ink" xmlns:am3d="http://schemas.microsoft.com/office/drawing/2017/model3d" xmlns:o="urn:schemas-microsoft-com:office:office" xmlns:oel="http://schemas.microsoft.com/office/2019/extlst" xmlns:r="http://schemas.openxmlformats.org/officeDocument/2006/relationships" xmlns:m="http://schemas.openxmlformats.org/officeDocument/2006/math" xmlns:v="urn:schemas-microsoft-com:vml" xmlns:wp14="http://schemas.microsoft.com/office/word/2010/wordprocessingDrawing" xmlns:wp="http://schemas.openxmlformats.org/drawingml/2006/wordprocessingDrawing" xmlns:w10="urn:schemas-microsoft-com:office:word" xmlns:w="http://schemas.openxmlformats.org/wordprocessingml/2006/main" xmlns:w14="http://schemas.microsoft.com/office/word/2010/wordml" xmlns:w15="http://schemas.microsoft.com/office/word/2012/wordml" xmlns:w16cei="http://schemas.microsoft.com/office/word/2026/wordml/cei" xmlns:w16cex="http://schemas.microsoft.com/office/word/2018/wordml/cex" xmlns:w16cid="http://schemas.microsoft.com/office/word/2016/wordml/cid" xmlns:w16="http://schemas.microsoft.com/office/word/2018/wordml" xmlns:w16du="http://schemas.microsoft.com/office/word/2023/wordml/word16du" xmlns:w16sdtdh="http://schemas.microsoft.com/office/word/2020/wordml/sdtdatahash" xmlns:w16sdtfl="http://schemas.microsoft.com/office/word/2024/wordml/sdtformatlock" xmlns:w16se="http://schemas.microsoft.com/office/word/2015/wordml/symex" xmlns:wpg="http://schemas.microsoft.com/office/word/2010/wordprocessingGroup" xmlns:wpi="http://schemas.microsoft.com/office/word/2010/wordprocessingInk" xmlns:wne="http://schemas.microsoft.com/office/word/2006/wordml" xmlns:wps="http://schemas.microsoft.com/office/word/2010/wordprocessingShape" mc:Ignorable="w14 w15 w16se w16cid w16 w16cex w16sdtdh w16sdtfl w16du wp14">
   <w:body>
     <w:p>
       <w:pPr>
@@ -194,7 +194,21 @@
         <w:rPr>
           <w:rFonts w:ascii="Aptos" w:hAnsi="Aptos"/>
         </w:rPr>
-        <w:t>(articles 45-46 du code de commerce)</w:t>
+        <w:t>(</w:t>
+      </w:r>
+      <w:proofErr w:type="gramStart"/>
+      <w:r>
+        <w:rPr>
+          <w:rFonts w:ascii="Aptos" w:hAnsi="Aptos"/>
+        </w:rPr>
+        <w:t>articles</w:t>
+      </w:r>
+      <w:proofErr w:type="gramEnd"/>
+      <w:r>
+        <w:rPr>
+          <w:rFonts w:ascii="Aptos" w:hAnsi="Aptos"/>
+        </w:rPr>
+        <w:t xml:space="preserve"> 45-46 du code de commerce)</w:t>
       </w:r>
     </w:p>
     <w:p>
@@ -231,7 +245,21 @@
         <w:rPr>
           <w:rFonts w:ascii="Aptos" w:hAnsi="Aptos"/>
         </w:rPr>
-        <w:t>(article 37 du code du commerce</w:t>
+        <w:t>(</w:t>
+      </w:r>
+      <w:proofErr w:type="gramStart"/>
+      <w:r>
+        <w:rPr>
+          <w:rFonts w:ascii="Aptos" w:hAnsi="Aptos"/>
+        </w:rPr>
+        <w:t>article</w:t>
+      </w:r>
+      <w:proofErr w:type="gramEnd"/>
+      <w:r>
+        <w:rPr>
+          <w:rFonts w:ascii="Aptos" w:hAnsi="Aptos"/>
+        </w:rPr>
+        <w:t xml:space="preserve"> 37 du code du commerce</w:t>
       </w:r>
     </w:p>
     <w:p>
@@ -408,7 +436,21 @@
               <w:rPr>
                 <w:rFonts w:ascii="Aptos" w:hAnsi="Aptos"/>
               </w:rPr>
-              <w:t>L'immatriculation d'une société ne peut être requise que par les gérants ou par les membres des organes d'administration, de direction ou de gestion. (article 38- 2</w:t>
+              <w:t>L'immatriculation d'une société ne peut être requise que par les gérants ou par les membres des organes d'administration, de direction ou de gestion. (</w:t>
+            </w:r>
+            <w:proofErr w:type="gramStart"/>
+            <w:r>
+              <w:rPr>
+                <w:rFonts w:ascii="Aptos" w:hAnsi="Aptos"/>
+              </w:rPr>
+              <w:t>article</w:t>
+            </w:r>
+            <w:proofErr w:type="gramEnd"/>
+            <w:r>
+              <w:rPr>
+                <w:rFonts w:ascii="Aptos" w:hAnsi="Aptos"/>
+              </w:rPr>
+              <w:t xml:space="preserve"> 38- 2</w:t>
             </w:r>
             <w:r>
               <w:rPr>
@@ -457,7 +499,21 @@
         <w:rPr>
           <w:rFonts w:ascii="Aptos" w:hAnsi="Aptos"/>
         </w:rPr>
-        <w:t xml:space="preserve"> .......................................... ……………….Raisons sociale ou dénomination</w:t>
+        <w:t xml:space="preserve"> .......................................... …………</w:t>
+      </w:r>
+      <w:proofErr w:type="gramStart"/>
+      <w:r>
+        <w:rPr>
+          <w:rFonts w:ascii="Aptos" w:hAnsi="Aptos"/>
+        </w:rPr>
+        <w:t>…….</w:t>
+      </w:r>
+      <w:proofErr w:type="gramEnd"/>
+      <w:r>
+        <w:rPr>
+          <w:rFonts w:ascii="Aptos" w:hAnsi="Aptos"/>
+        </w:rPr>
+        <w:t>Raisons sociale ou dénomination</w:t>
       </w:r>
       <w:r>
         <w:rPr>
@@ -465,14 +521,24 @@
           <w:b/>
           <w:bCs/>
         </w:rPr>
-        <w:t xml:space="preserve"> ……….</w:t>
-      </w:r>
+        <w:t xml:space="preserve"> …</w:t>
+      </w:r>
+      <w:proofErr w:type="gramStart"/>
       <w:r>
         <w:rPr>
           <w:rFonts w:ascii="Aptos" w:hAnsi="Aptos"/>
           <w:b/>
           <w:bCs/>
         </w:rPr>
+        <w:t>…….</w:t>
+      </w:r>
+      <w:proofErr w:type="gramEnd"/>
+      <w:r>
+        <w:rPr>
+          <w:rFonts w:ascii="Aptos" w:hAnsi="Aptos"/>
+          <w:b/>
+          <w:bCs/>
+        </w:rPr>
         <w:t>_SOCIETE_RAISON_SOCIALE_ _SOCIETE_FORME_JURIDIQUE_</w:t>
       </w:r>
       <w:r>
@@ -489,8 +555,18 @@
           <w:b/>
           <w:bCs/>
         </w:rPr>
-        <w:t>………………………………….</w:t>
-      </w:r>
+        <w:t>……………………………</w:t>
+      </w:r>
+      <w:proofErr w:type="gramStart"/>
+      <w:r>
+        <w:rPr>
+          <w:rFonts w:ascii="Aptos" w:hAnsi="Aptos"/>
+          <w:b/>
+          <w:bCs/>
+        </w:rPr>
+        <w:t>…….</w:t>
+      </w:r>
+      <w:proofErr w:type="gramEnd"/>
       <w:r>
         <w:rPr>
           <w:rFonts w:ascii="Aptos" w:hAnsi="Aptos"/>
@@ -630,7 +706,35 @@
               <w:rPr>
                 <w:rFonts w:ascii="Aptos" w:hAnsi="Aptos"/>
               </w:rPr>
-              <w:t xml:space="preserve">Déclaration déposée le......................................... sous n° ................................  au registre chronologique.         </w:t>
+              <w:t xml:space="preserve">Déclaration déposée le......................................... </w:t>
+            </w:r>
+            <w:proofErr w:type="gramStart"/>
+            <w:r>
+              <w:rPr>
+                <w:rFonts w:ascii="Aptos" w:hAnsi="Aptos"/>
+              </w:rPr>
+              <w:t>sous</w:t>
+            </w:r>
+            <w:proofErr w:type="gramEnd"/>
+            <w:r>
+              <w:rPr>
+                <w:rFonts w:ascii="Aptos" w:hAnsi="Aptos"/>
+              </w:rPr>
+              <w:t xml:space="preserve"> n° ................................  </w:t>
+            </w:r>
+            <w:proofErr w:type="gramStart"/>
+            <w:r>
+              <w:rPr>
+                <w:rFonts w:ascii="Aptos" w:hAnsi="Aptos"/>
+              </w:rPr>
+              <w:t>au</w:t>
+            </w:r>
+            <w:proofErr w:type="gramEnd"/>
+            <w:r>
+              <w:rPr>
+                <w:rFonts w:ascii="Aptos" w:hAnsi="Aptos"/>
+              </w:rPr>
+              <w:t xml:space="preserve"> registre chronologique.         </w:t>
             </w:r>
           </w:p>
           <w:p>
@@ -789,7 +893,6 @@
           <w:tab w:val="left" w:leader="dot" w:pos="5529"/>
           <w:tab w:val="left" w:pos="7655"/>
         </w:tabs>
-        <w:jc w:val="both"/>
         <w:rPr>
           <w:rFonts w:ascii="Aptos" w:hAnsi="Aptos"/>
         </w:rPr>
@@ -854,7 +957,6 @@
           <w:tab w:val="left" w:leader="dot" w:pos="5529"/>
           <w:tab w:val="left" w:pos="8931"/>
         </w:tabs>
-        <w:jc w:val="both"/>
         <w:rPr>
           <w:rFonts w:ascii="Aptos" w:hAnsi="Aptos"/>
         </w:rPr>
@@ -897,7 +999,6 @@
         <w:tabs>
           <w:tab w:val="left" w:leader="dot" w:pos="8931"/>
         </w:tabs>
-        <w:jc w:val="both"/>
         <w:rPr>
           <w:rFonts w:ascii="Aptos" w:hAnsi="Aptos"/>
         </w:rPr>
@@ -930,7 +1031,6 @@
           <w:tab w:val="left" w:pos="8789"/>
         </w:tabs>
         <w:spacing w:line="276" w:lineRule="auto"/>
-        <w:jc w:val="both"/>
         <w:rPr>
           <w:rFonts w:ascii="Aptos" w:hAnsi="Aptos"/>
           <w:b/>
@@ -955,8 +1055,27 @@
           <w:b/>
           <w:bCs/>
         </w:rPr>
-        <w:t>…………………………………………………..</w:t>
-      </w:r>
+        <w:t>……………………………………………</w:t>
+      </w:r>
+      <w:proofErr w:type="gramStart"/>
+      <w:r>
+        <w:rPr>
+          <w:rFonts w:ascii="Aptos" w:hAnsi="Aptos"/>
+          <w:b/>
+          <w:bCs/>
+        </w:rPr>
+        <w:t>…….</w:t>
+      </w:r>
+      <w:proofErr w:type="gramEnd"/>
+      <w:r>
+        <w:rPr>
+          <w:rFonts w:ascii="Aptos" w:hAnsi="Aptos"/>
+          <w:b/>
+          <w:bCs/>
+        </w:rPr>
+        <w:t>.</w:t>
+      </w:r>
+      <w:proofErr w:type="gramStart"/>
       <w:r>
         <w:rPr>
           <w:rFonts w:ascii="Aptos" w:hAnsi="Aptos"/>
@@ -979,7 +1098,14 @@
         <w:rPr>
           <w:rFonts w:ascii="Aptos" w:hAnsi="Aptos"/>
         </w:rPr>
-        <w:t>Patente n°.........................................</w:t>
+        <w:t>Patente</w:t>
+      </w:r>
+      <w:proofErr w:type="gramEnd"/>
+      <w:r>
+        <w:rPr>
+          <w:rFonts w:ascii="Aptos" w:hAnsi="Aptos"/>
+        </w:rPr>
+        <w:t xml:space="preserve"> n°.........................................</w:t>
       </w:r>
       <w:r>
         <w:rPr>
@@ -990,7 +1116,6 @@
     </w:p>
     <w:p>
       <w:pPr>
-        <w:jc w:val="both"/>
         <w:rPr>
           <w:rFonts w:ascii="Aptos" w:eastAsia="Garamond" w:hAnsi="Aptos" w:cs="Garamond"/>
           <w:b/>
@@ -1003,7 +1128,21 @@
         <w:rPr>
           <w:rFonts w:ascii="Aptos" w:hAnsi="Aptos"/>
         </w:rPr>
-        <w:t xml:space="preserve">4) Siège Social :……….. </w:t>
+        <w:t>4) Siège Social</w:t>
+      </w:r>
+      <w:proofErr w:type="gramStart"/>
+      <w:r>
+        <w:rPr>
+          <w:rFonts w:ascii="Aptos" w:hAnsi="Aptos"/>
+        </w:rPr>
+        <w:t> :……….</w:t>
+      </w:r>
+      <w:proofErr w:type="gramEnd"/>
+      <w:r>
+        <w:rPr>
+          <w:rFonts w:ascii="Aptos" w:hAnsi="Aptos"/>
+        </w:rPr>
+        <w:t xml:space="preserve">. </w:t>
       </w:r>
       <w:bookmarkStart w:id="0" w:name="_Hlk123887632"/>
       <w:r>
@@ -1049,7 +1188,35 @@
         <w:rPr>
           <w:rFonts w:ascii="Aptos" w:hAnsi="Aptos"/>
         </w:rPr>
-        <w:t>Précédemment exploité par ( s’ il y’a lieu) .R.C. n°……………………………................................……...</w:t>
+        <w:t xml:space="preserve">Précédemment exploité par </w:t>
+      </w:r>
+      <w:proofErr w:type="gramStart"/>
+      <w:r>
+        <w:rPr>
+          <w:rFonts w:ascii="Aptos" w:hAnsi="Aptos"/>
+        </w:rPr>
+        <w:t>( s</w:t>
+      </w:r>
+      <w:proofErr w:type="gramEnd"/>
+      <w:r>
+        <w:rPr>
+          <w:rFonts w:ascii="Aptos" w:hAnsi="Aptos"/>
+        </w:rPr>
+        <w:t>’ il y’a lieu</w:t>
+      </w:r>
+      <w:proofErr w:type="gramStart"/>
+      <w:r>
+        <w:rPr>
+          <w:rFonts w:ascii="Aptos" w:hAnsi="Aptos"/>
+        </w:rPr>
+        <w:t>) .</w:t>
+      </w:r>
+      <w:proofErr w:type="gramEnd"/>
+      <w:r>
+        <w:rPr>
+          <w:rFonts w:ascii="Aptos" w:hAnsi="Aptos"/>
+        </w:rPr>
+        <w:t>R.C. n°……………………………................................……...</w:t>
       </w:r>
       <w:r>
         <w:rPr>
@@ -1133,7 +1300,6 @@
           <w:tab w:val="left" w:leader="dot" w:pos="3686"/>
           <w:tab w:val="left" w:pos="8789"/>
         </w:tabs>
-        <w:jc w:val="both"/>
         <w:rPr>
           <w:rFonts w:ascii="Aptos" w:hAnsi="Aptos"/>
         </w:rPr>
@@ -1150,7 +1316,15 @@
           <w:b/>
           <w:bCs/>
         </w:rPr>
-        <w:t>100 000.00 DHS</w:t>
+        <w:t xml:space="preserve">_SOCIETE_CAPITAL_ </w:t>
+      </w:r>
+      <w:r>
+        <w:rPr>
+          <w:rFonts w:ascii="Aptos" w:hAnsi="Aptos"/>
+          <w:b/>
+          <w:bCs/>
+        </w:rPr>
+        <w:t>DHS</w:t>
       </w:r>
       <w:r>
         <w:rPr>
@@ -1176,7 +1350,21 @@
         <w:rPr>
           <w:rFonts w:ascii="Aptos" w:hAnsi="Aptos"/>
         </w:rPr>
-        <w:t>………………………………..</w:t>
+        <w:t>………………</w:t>
+      </w:r>
+      <w:proofErr w:type="gramStart"/>
+      <w:r>
+        <w:rPr>
+          <w:rFonts w:ascii="Aptos" w:hAnsi="Aptos"/>
+        </w:rPr>
+        <w:t>…….</w:t>
+      </w:r>
+      <w:proofErr w:type="gramEnd"/>
+      <w:r>
+        <w:rPr>
+          <w:rFonts w:ascii="Aptos" w:hAnsi="Aptos"/>
+        </w:rPr>
+        <w:t>.</w:t>
       </w:r>
     </w:p>
     <w:p>
@@ -1261,7 +1449,21 @@
         <w:rPr>
           <w:rFonts w:ascii="Aptos" w:hAnsi="Aptos"/>
         </w:rPr>
-        <w:t>11) Nom, Prénoms, date et lieu de naissance, nationalité, domicile et n° C.l.N (1) -a) des associés autres que les actionnaires et les commanditaires -b) des associés ou tiers autorisés à administrer gérer et signer pour la société -c) des gérants, membres des organes d'administration de direction ou de gestion ou des directeurs ; s'il s'agit d'une personne morale : raison sociale ou dénomination, forme juridique, siège social, objet, numéro du registre du commerce et références du représentant permanent.</w:t>
+        <w:t xml:space="preserve">11) Nom, Prénoms, date et lieu de naissance, nationalité, domicile et n° </w:t>
+      </w:r>
+      <w:proofErr w:type="spellStart"/>
+      <w:r>
+        <w:rPr>
+          <w:rFonts w:ascii="Aptos" w:hAnsi="Aptos"/>
+        </w:rPr>
+        <w:t>C.l.N</w:t>
+      </w:r>
+      <w:proofErr w:type="spellEnd"/>
+      <w:r>
+        <w:rPr>
+          <w:rFonts w:ascii="Aptos" w:hAnsi="Aptos"/>
+        </w:rPr>
+        <w:t xml:space="preserve"> (1) -a) des associés autres que les actionnaires et les commanditaires -b) des associés ou tiers autorisés à administrer gérer et signer pour la société -c) des gérants, membres des organes d'administration de direction ou de gestion ou des directeurs ; s'il s'agit d'une personne morale : raison sociale ou dénomination, forme juridique, siège social, objet, numéro du registre du commerce et références du représentant permanent.</w:t>
       </w:r>
     </w:p>
     <w:p>
@@ -1328,6 +1530,7 @@
               <w:bottom w:val="nil"/>
               <w:right w:val="single" w:sz="6" w:space="0" w:color="auto"/>
             </w:tcBorders>
+            <w:shd w:val="clear" w:color="auto" w:fill="C7CCE4" w:themeFill="text2" w:themeFillTint="33"/>
             <w:vAlign w:val="center"/>
           </w:tcPr>
           <w:p>
@@ -1360,6 +1563,7 @@
               <w:bottom w:val="nil"/>
               <w:right w:val="single" w:sz="6" w:space="0" w:color="auto"/>
             </w:tcBorders>
+            <w:shd w:val="clear" w:color="auto" w:fill="C7CCE4" w:themeFill="text2" w:themeFillTint="33"/>
             <w:vAlign w:val="center"/>
           </w:tcPr>
           <w:p>
@@ -1392,6 +1596,7 @@
               <w:bottom w:val="nil"/>
               <w:right w:val="single" w:sz="6" w:space="0" w:color="auto"/>
             </w:tcBorders>
+            <w:shd w:val="clear" w:color="auto" w:fill="C7CCE4" w:themeFill="text2" w:themeFillTint="33"/>
             <w:vAlign w:val="center"/>
           </w:tcPr>
           <w:p>
@@ -1424,6 +1629,7 @@
               <w:bottom w:val="nil"/>
               <w:right w:val="single" w:sz="6" w:space="0" w:color="auto"/>
             </w:tcBorders>
+            <w:shd w:val="clear" w:color="auto" w:fill="C7CCE4" w:themeFill="text2" w:themeFillTint="33"/>
             <w:vAlign w:val="center"/>
           </w:tcPr>
           <w:p>
@@ -1456,6 +1662,7 @@
               <w:bottom w:val="nil"/>
               <w:right w:val="single" w:sz="6" w:space="0" w:color="auto"/>
             </w:tcBorders>
+            <w:shd w:val="clear" w:color="auto" w:fill="C7CCE4" w:themeFill="text2" w:themeFillTint="33"/>
             <w:vAlign w:val="center"/>
           </w:tcPr>
           <w:p>
@@ -1488,6 +1695,7 @@
               <w:bottom w:val="nil"/>
               <w:right w:val="single" w:sz="6" w:space="0" w:color="auto"/>
             </w:tcBorders>
+            <w:shd w:val="clear" w:color="auto" w:fill="C7CCE4" w:themeFill="text2" w:themeFillTint="33"/>
             <w:vAlign w:val="center"/>
           </w:tcPr>
           <w:p>
@@ -1769,12 +1977,21 @@
           <w:sz w:val="18"/>
         </w:rPr>
       </w:pPr>
+      <w:proofErr w:type="gramStart"/>
       <w:r>
         <w:rPr>
           <w:rFonts w:ascii="Aptos" w:hAnsi="Aptos"/>
           <w:sz w:val="18"/>
         </w:rPr>
-        <w:t>pour les étrangers résidents au Maroc n° de la carte d'immatriculation, pour les non-résidents n° du passeport ou autre pièce d'identité, en indiquant la date et le lieu de délivrance. ----------------------------------------------------------------------------------------------------------------------------------------------------------------------------------------------</w:t>
+        <w:t>pour</w:t>
+      </w:r>
+      <w:proofErr w:type="gramEnd"/>
+      <w:r>
+        <w:rPr>
+          <w:rFonts w:ascii="Aptos" w:hAnsi="Aptos"/>
+          <w:sz w:val="18"/>
+        </w:rPr>
+        <w:t xml:space="preserve"> les étrangers résidents au Maroc n° de la carte d'immatriculation, pour les non-résidents n° du passeport ou autre pièce d'identité, en indiquant la date et le lieu de délivrance. ----------------------------------------------------------------------------------------------------------------------------------------------------------------------------------------------</w:t>
       </w:r>
     </w:p>
     <w:p>
@@ -2081,7 +2298,7 @@
 </file>
 
 <file path=word/numbering.xml><?xml version="1.0" encoding="utf-8"?>
-<w:numbering xmlns:wpc="http://schemas.microsoft.com/office/word/2010/wordprocessingCanvas" xmlns:cx="http://schemas.microsoft.com/office/drawing/2014/chartex" xmlns:cx1="http://schemas.microsoft.com/office/drawing/2015/9/8/chartex" xmlns:cx2="http://schemas.microsoft.com/office/drawing/2015/10/21/chartex" xmlns:cx3="http://schemas.microsoft.com/office/drawing/2016/5/9/chartex" xmlns:cx4="http://schemas.microsoft.com/office/drawing/2016/5/10/chartex" xmlns:cx5="http://schemas.microsoft.com/office/drawing/2016/5/11/chartex" xmlns:cx6="http://schemas.microsoft.com/office/drawing/2016/5/12/chartex" xmlns:cx7="http://schemas.microsoft.com/office/drawing/2016/5/13/chartex" xmlns:cx8="http://schemas.microsoft.com/office/drawing/2016/5/14/chartex" xmlns:mc="http://schemas.openxmlformats.org/markup-compatibility/2006" xmlns:aink="http://schemas.microsoft.com/office/drawing/2016/ink" xmlns:am3d="http://schemas.microsoft.com/office/drawing/2017/model3d" xmlns:o="urn:schemas-microsoft-com:office:office" xmlns:oel="http://schemas.microsoft.com/office/2019/extlst" xmlns:r="http://schemas.openxmlformats.org/officeDocument/2006/relationships" xmlns:m="http://schemas.openxmlformats.org/officeDocument/2006/math" xmlns:v="urn:schemas-microsoft-com:vml" xmlns:wp14="http://schemas.microsoft.com/office/word/2010/wordprocessingDrawing" xmlns:wp="http://schemas.openxmlformats.org/drawingml/2006/wordprocessingDrawing" xmlns:w10="urn:schemas-microsoft-com:office:word" xmlns:w="http://schemas.openxmlformats.org/wordprocessingml/2006/main" xmlns:w14="http://schemas.microsoft.com/office/word/2010/wordml" xmlns:w15="http://schemas.microsoft.com/office/word/2012/wordml" xmlns:w16cex="http://schemas.microsoft.com/office/word/2018/wordml/cex" xmlns:w16cid="http://schemas.microsoft.com/office/word/2016/wordml/cid" xmlns:w16="http://schemas.microsoft.com/office/word/2018/wordml" xmlns:w16sdtdh="http://schemas.microsoft.com/office/word/2020/wordml/sdtdatahash" xmlns:w16se="http://schemas.microsoft.com/office/word/2015/wordml/symex" xmlns:wpg="http://schemas.microsoft.com/office/word/2010/wordprocessingGroup" xmlns:wpi="http://schemas.microsoft.com/office/word/2010/wordprocessingInk" xmlns:wne="http://schemas.microsoft.com/office/word/2006/wordml" xmlns:wps="http://schemas.microsoft.com/office/word/2010/wordprocessingShape" mc:Ignorable="w14 w15 w16se w16cid w16 w16cex w16sdtdh wp14">
+<w:numbering xmlns:wpc="http://schemas.microsoft.com/office/word/2010/wordprocessingCanvas" xmlns:cx="http://schemas.microsoft.com/office/drawing/2014/chartex" xmlns:cx1="http://schemas.microsoft.com/office/drawing/2015/9/8/chartex" xmlns:cx2="http://schemas.microsoft.com/office/drawing/2015/10/21/chartex" xmlns:cx3="http://schemas.microsoft.com/office/drawing/2016/5/9/chartex" xmlns:cx4="http://schemas.microsoft.com/office/drawing/2016/5/10/chartex" xmlns:cx5="http://schemas.microsoft.com/office/drawing/2016/5/11/chartex" xmlns:cx6="http://schemas.microsoft.com/office/drawing/2016/5/12/chartex" xmlns:cx7="http://schemas.microsoft.com/office/drawing/2016/5/13/chartex" xmlns:cx8="http://schemas.microsoft.com/office/drawing/2016/5/14/chartex" xmlns:mc="http://schemas.openxmlformats.org/markup-compatibility/2006" xmlns:aink="http://schemas.microsoft.com/office/drawing/2016/ink" xmlns:am3d="http://schemas.microsoft.com/office/drawing/2017/model3d" xmlns:o="urn:schemas-microsoft-com:office:office" xmlns:oel="http://schemas.microsoft.com/office/2019/extlst" xmlns:r="http://schemas.openxmlformats.org/officeDocument/2006/relationships" xmlns:m="http://schemas.openxmlformats.org/officeDocument/2006/math" xmlns:v="urn:schemas-microsoft-com:vml" xmlns:wp14="http://schemas.microsoft.com/office/word/2010/wordprocessingDrawing" xmlns:wp="http://schemas.openxmlformats.org/drawingml/2006/wordprocessingDrawing" xmlns:w10="urn:schemas-microsoft-com:office:word" xmlns:w="http://schemas.openxmlformats.org/wordprocessingml/2006/main" xmlns:w14="http://schemas.microsoft.com/office/word/2010/wordml" xmlns:w15="http://schemas.microsoft.com/office/word/2012/wordml" xmlns:w16cei="http://schemas.microsoft.com/office/word/2026/wordml/cei" xmlns:w16cex="http://schemas.microsoft.com/office/word/2018/wordml/cex" xmlns:w16cid="http://schemas.microsoft.com/office/word/2016/wordml/cid" xmlns:w16="http://schemas.microsoft.com/office/word/2018/wordml" xmlns:w16du="http://schemas.microsoft.com/office/word/2023/wordml/word16du" xmlns:w16sdtdh="http://schemas.microsoft.com/office/word/2020/wordml/sdtdatahash" xmlns:w16sdtfl="http://schemas.microsoft.com/office/word/2024/wordml/sdtformatlock" xmlns:w16se="http://schemas.microsoft.com/office/word/2015/wordml/symex" xmlns:wpg="http://schemas.microsoft.com/office/word/2010/wordprocessingGroup" xmlns:wpi="http://schemas.microsoft.com/office/word/2010/wordprocessingInk" xmlns:wne="http://schemas.microsoft.com/office/word/2006/wordml" xmlns:wps="http://schemas.microsoft.com/office/word/2010/wordprocessingShape" mc:Ignorable="w14 w15 w16se w16cid w16 w16cex w16sdtdh w16sdtfl w16du wp14">
   <w:abstractNum w:abstractNumId="0" w15:restartNumberingAfterBreak="0">
     <w:nsid w:val="3955304A"/>
     <w:multiLevelType w:val="hybridMultilevel"/>
@@ -2274,7 +2491,7 @@
 </file>
 
 <file path=word/styles.xml><?xml version="1.0" encoding="utf-8"?>
-<w:styles xmlns:mc="http://schemas.openxmlformats.org/markup-compatibility/2006" xmlns:r="http://schemas.openxmlformats.org/officeDocument/2006/relationships" xmlns:w="http://schemas.openxmlformats.org/wordprocessingml/2006/main" xmlns:w14="http://schemas.microsoft.com/office/word/2010/wordml" xmlns:w15="http://schemas.microsoft.com/office/word/2012/wordml" xmlns:w16cex="http://schemas.microsoft.com/office/word/2018/wordml/cex" xmlns:w16cid="http://schemas.microsoft.com/office/word/2016/wordml/cid" xmlns:w16="http://schemas.microsoft.com/office/word/2018/wordml" xmlns:w16sdtdh="http://schemas.microsoft.com/office/word/2020/wordml/sdtdatahash" xmlns:w16se="http://schemas.microsoft.com/office/word/2015/wordml/symex" mc:Ignorable="w14 w15 w16se w16cid w16 w16cex w16sdtdh">
+<w:styles xmlns:mc="http://schemas.openxmlformats.org/markup-compatibility/2006" xmlns:r="http://schemas.openxmlformats.org/officeDocument/2006/relationships" xmlns:w="http://schemas.openxmlformats.org/wordprocessingml/2006/main" xmlns:w14="http://schemas.microsoft.com/office/word/2010/wordml" xmlns:w15="http://schemas.microsoft.com/office/word/2012/wordml" xmlns:w16cex="http://schemas.microsoft.com/office/word/2018/wordml/cex" xmlns:w16cid="http://schemas.microsoft.com/office/word/2016/wordml/cid" xmlns:w16="http://schemas.microsoft.com/office/word/2018/wordml" xmlns:w16du="http://schemas.microsoft.com/office/word/2023/wordml/word16du" xmlns:w16sdtdh="http://schemas.microsoft.com/office/word/2020/wordml/sdtdatahash" xmlns:w16sdtfl="http://schemas.microsoft.com/office/word/2024/wordml/sdtformatlock" xmlns:w16se="http://schemas.microsoft.com/office/word/2015/wordml/symex" mc:Ignorable="w14 w15 w16se w16cid w16 w16cex w16sdtdh w16sdtfl w16du">
   <w:docDefaults>
     <w:rPrDefault>
       <w:rPr>
@@ -3073,14 +3290,6 @@
       <w:b/>
       <w:bCs/>
       <w:color w:val="31479E" w:themeColor="accent1" w:themeShade="BF"/>
-      <w14:textFill>
-        <w14:solidFill>
-          <w14:schemeClr w14:val="accent1">
-            <w14:lumMod w14:val="75000"/>
-            <w14:lumMod w14:val="75000"/>
-          </w14:schemeClr>
-        </w14:solidFill>
-      </w14:textFill>
     </w:rPr>
   </w:style>
   <w:style w:type="character" w:customStyle="1" w:styleId="Car4">

</xml_diff>